<commit_message>
Chat s ChatGPT: nový podepsaný instalátor a příručka
Co-Authored-By: Claude Sonnet 5.5 <noreply@anthropic.com>
Claude-Session: https://claude.ai/code/session_01TwqswaCHEdGxzojpJdye3M
</commit_message>
<xml_diff>
--- a/prirucky/Chat_s_ChatGPT_prirucka.docx
+++ b/prirucky/Chat_s_ChatGPT_prirucka.docx
@@ -1168,6 +1168,19 @@
         <w:spacing w:after="80" w:line="300"/>
       </w:pPr>
       <w:r>
+        <w:t xml:space="preserve">Vrátit výchozí model Codexu: smaže model, který si program uložil (viz Chyba modelu), a příště se použije výchozí model Codexu.</w:t>
+      </w:r>
+    </w:p>
+    <w:p>
+      <w:pPr>
+        <w:pStyle w:val="ListParagraph"/>
+        <w:numPr>
+          <w:ilvl w:val="0"/>
+          <w:numId w:val="2"/>
+        </w:numPr>
+        <w:spacing w:after="80" w:line="300"/>
+      </w:pPr>
+      <w:r>
         <w:t xml:space="preserve">Otevřít protokol (log): otevře soubor s podrobným záznamem činnosti. Hodí se při hledání chyb.</w:t>
       </w:r>
     </w:p>
@@ -1280,6 +1293,22 @@
       </w:pPr>
       <w:r>
         <w:t xml:space="preserve">Stiskněte Ctrl+P a přihlaste se v prohlížeči. Program po chybě přihlášení také sám řekne „Ověřuji přihlášení“ a v případě potřeby otevře prohlížeč.</w:t>
+      </w:r>
+    </w:p>
+    <w:p>
+      <w:pPr>
+        <w:pStyle w:val="Heading2"/>
+      </w:pPr>
+      <w:r>
+        <w:t xml:space="preserve">Hlášení, že model není podporován</w:t>
+      </w:r>
+    </w:p>
+    <w:p>
+      <w:pPr>
+        <w:spacing w:after="120" w:line="300"/>
+      </w:pPr>
+      <w:r>
+        <w:t xml:space="preserve">Na jednom počítači program funguje a na druhém ohlásí, že model není v Codexu podporován. Příčinou bývá starší verze Codexu nebo jiné výchozí nastavení modelu. Program si v takovém případě sám vyžádá seznam modelů, které váš účet podporuje, a zkouší je postupně. Řekne „Tento model účet v Codexu nepodporuje. Zkouším jiný“ a zprávu, kterou jste zrovna odeslali, pošle znovu. Jakmile některý model odpoví, program si ho zapamatuje jako výchozí a napíše to do Historie. Kdyby nefungoval žádný, aktualizujte Codex příkazem npm install -g @openai/codex@latest.</w:t>
       </w:r>
     </w:p>
     <w:p>

</xml_diff>